<commit_message>
Drop CI/CD from the new-bench prompt
Two jobs were bolted together. Building a bench and wiring up a deploy pipeline
happen at different times, sometimes days apart, and only some apps on a bench
want CI/CD at all. Step 7 also duplicated CLAUDE-PROMPT.md badly enough to drift
from it.

The prompt now stops when the bench is live and verified, and says so up front,
including an explicit instruction not to create workflows, deploy users or SSH
keys for deployment - otherwise a helpful session will do it anyway.

It ends by printing the stack appName and the site name together, because those
are exactly the two values the CI/CD prompt asks for next.

Compose file re-verified after the edit: nine services, five volumes, bootstrap
still passes bash -n.

Co-Authored-By: Claude Opus 5 (1M context) <noreply@anthropic.com>
</commit_message>
<xml_diff>
--- a/docs/CICD-New-Bench-Prompt.docx
+++ b/docs/CICD-New-Bench-Prompt.docx
@@ -87,7 +87,27 @@
           <w:rFonts w:ascii="Consolas" w:hAnsi="Consolas"/>
           <w:sz w:val="17"/>
         </w:rPr>
-        <w:t>as its own Dokploy project, then set up CI/CD for its custom apps.</w:t>
+        <w:t>as its own Dokploy project. Stop when the bench is live and verified - I set</w:t>
+      </w:r>
+      <w:r>
+        <w:br/>
+      </w:r>
+      <w:r>
+        <w:rPr>
+          <w:rFonts w:ascii="Consolas" w:hAnsi="Consolas"/>
+          <w:sz w:val="17"/>
+        </w:rPr>
+        <w:t>up CI/CD separately, with its own prompt. Do not create workflows, deploy</w:t>
+      </w:r>
+      <w:r>
+        <w:br/>
+      </w:r>
+      <w:r>
+        <w:rPr>
+          <w:rFonts w:ascii="Consolas" w:hAnsi="Consolas"/>
+          <w:sz w:val="17"/>
+        </w:rPr>
+        <w:t>users or SSH keys for deployment.</w:t>
       </w:r>
       <w:r>
         <w:br/>
@@ -4270,165 +4290,17 @@
           <w:rFonts w:ascii="Consolas" w:hAnsi="Consolas"/>
           <w:sz w:val="17"/>
         </w:rPr>
-        <w:t>=== STEP 7: CI/CD ===</w:t>
-      </w:r>
-      <w:r>
-        <w:br/>
-      </w:r>
-      <w:r>
-        <w:rPr>
-          <w:rFonts w:ascii="Consolas" w:hAnsi="Consolas"/>
-          <w:sz w:val="17"/>
-        </w:rPr>
-      </w:r>
-      <w:r>
-        <w:br/>
-      </w:r>
-      <w:r>
-        <w:rPr>
-          <w:rFonts w:ascii="Consolas" w:hAnsi="Consolas"/>
-          <w:sz w:val="17"/>
-        </w:rPr>
-        <w:t>For each custom app, set up the deploy pipeline. In short:</w:t>
-      </w:r>
-      <w:r>
-        <w:br/>
-      </w:r>
-      <w:r>
-        <w:rPr>
-          <w:rFonts w:ascii="Consolas" w:hAnsi="Consolas"/>
-          <w:sz w:val="17"/>
-        </w:rPr>
-        <w:t xml:space="preserve">  - a shared script on the server, /usr/local/bin/deploy-&lt;client&gt;-app.sh,</w:t>
-      </w:r>
-      <w:r>
-        <w:br/>
-      </w:r>
-      <w:r>
-        <w:rPr>
-          <w:rFonts w:ascii="Consolas" w:hAnsi="Consolas"/>
-          <w:sz w:val="17"/>
-        </w:rPr>
-        <w:t xml:space="preserve">    taking &lt;app&gt; &lt;branch&gt; &lt;stack&gt; &lt;site&gt;. It pulls inside the web container,</w:t>
-      </w:r>
-      <w:r>
-        <w:br/>
-      </w:r>
-      <w:r>
-        <w:rPr>
-          <w:rFonts w:ascii="Consolas" w:hAnsi="Consolas"/>
-          <w:sz w:val="17"/>
-        </w:rPr>
-        <w:t xml:space="preserve">    refuses to run against a dirty working tree, migrates, restarts web,</w:t>
-      </w:r>
-      <w:r>
-        <w:br/>
-      </w:r>
-      <w:r>
-        <w:rPr>
-          <w:rFonts w:ascii="Consolas" w:hAnsi="Consolas"/>
-          <w:sz w:val="17"/>
-        </w:rPr>
-        <w:t xml:space="preserve">    worker and scheduler, then polls the site until it answers.</w:t>
-      </w:r>
-      <w:r>
-        <w:br/>
-      </w:r>
-      <w:r>
-        <w:rPr>
-          <w:rFonts w:ascii="Consolas" w:hAnsi="Consolas"/>
-          <w:sz w:val="17"/>
-        </w:rPr>
-        <w:t xml:space="preserve">  - a `deploy` user on the server in the docker group, key-only login</w:t>
-      </w:r>
-      <w:r>
-        <w:br/>
-      </w:r>
-      <w:r>
-        <w:rPr>
-          <w:rFonts w:ascii="Consolas" w:hAnsi="Consolas"/>
-          <w:sz w:val="17"/>
-        </w:rPr>
-        <w:t xml:space="preserve">  - GitHub Actions calling it over SSH, with DEPLOY_HOST / DEPLOY_USER /</w:t>
-      </w:r>
-      <w:r>
-        <w:br/>
-      </w:r>
-      <w:r>
-        <w:rPr>
-          <w:rFonts w:ascii="Consolas" w:hAnsi="Consolas"/>
-          <w:sz w:val="17"/>
-        </w:rPr>
-        <w:t xml:space="preserve">    DEPLOY_SSH_KEY as repo secrets</w:t>
-      </w:r>
-      <w:r>
-        <w:br/>
-      </w:r>
-      <w:r>
-        <w:rPr>
-          <w:rFonts w:ascii="Consolas" w:hAnsi="Consolas"/>
-          <w:sz w:val="17"/>
-        </w:rPr>
-        <w:t xml:space="preserve">  - a matrix with fail-fast: false if an app is on several benches</w:t>
-      </w:r>
-      <w:r>
-        <w:br/>
-      </w:r>
-      <w:r>
-        <w:rPr>
-          <w:rFonts w:ascii="Consolas" w:hAnsi="Consolas"/>
-          <w:sz w:val="17"/>
-        </w:rPr>
-        <w:t xml:space="preserve">  - a lint gate of ONLY ruff E9,F821,F632,F702 - the full config reports</w:t>
-      </w:r>
-      <w:r>
-        <w:br/>
-      </w:r>
-      <w:r>
-        <w:rPr>
-          <w:rFonts w:ascii="Consolas" w:hAnsi="Consolas"/>
-          <w:sz w:val="17"/>
-        </w:rPr>
-        <w:t xml:space="preserve">    hundreds of style findings and makes the pipeline permanently red</w:t>
-      </w:r>
-      <w:r>
-        <w:br/>
-      </w:r>
-      <w:r>
-        <w:rPr>
-          <w:rFonts w:ascii="Consolas" w:hAnsi="Consolas"/>
-          <w:sz w:val="17"/>
-        </w:rPr>
-        <w:t xml:space="preserve">  - smoke test one target by hand before turning the workflow on</w:t>
-      </w:r>
-      <w:r>
-        <w:br/>
-      </w:r>
-      <w:r>
-        <w:rPr>
-          <w:rFonts w:ascii="Consolas" w:hAnsi="Consolas"/>
-          <w:sz w:val="17"/>
-        </w:rPr>
-      </w:r>
-      <w:r>
-        <w:br/>
-      </w:r>
-      <w:r>
-        <w:rPr>
-          <w:rFonts w:ascii="Consolas" w:hAnsi="Consolas"/>
-          <w:sz w:val="17"/>
-        </w:rPr>
-        <w:t>The full version of this is docs/CLAUDE-PROMPT.md in the tnc_v2_360ithub</w:t>
-      </w:r>
-      <w:r>
-        <w:br/>
-      </w:r>
-      <w:r>
-        <w:rPr>
-          <w:rFonts w:ascii="Consolas" w:hAnsi="Consolas"/>
-          <w:sz w:val="17"/>
-        </w:rPr>
-        <w:t>repo. Use it if you can reach that repo.</w:t>
+        <w:t>That is the end of the job. Finish by printing the stack appName and the site</w:t>
+      </w:r>
+      <w:r>
+        <w:br/>
+      </w:r>
+      <w:r>
+        <w:rPr>
+          <w:rFonts w:ascii="Consolas" w:hAnsi="Consolas"/>
+          <w:sz w:val="17"/>
+        </w:rPr>
+        <w:t>name together - I need both when I set up CI/CD separately.</w:t>
       </w:r>
       <w:r>
         <w:br/>

</xml_diff>